<commit_message>
docs: align fleet manual strictly with 1,849 active installed machines, SPL, and POT
</commit_message>
<xml_diff>
--- a/docs/Coripet_RVM_Predictor_Complete_System_Manual.docx
+++ b/docs/Coripet_RVM_Predictor_Complete_System_Manual.docx
@@ -631,7 +631,7 @@
                 <w:color w:val="0F172A"/>
                 <w:sz w:val="18"/>
               </w:rPr>
-              <w:t>PostgreSQL 16 with B-Tree Indexed 3-Way UNION Architecture (1,849 Active Machines, master_daily_rvm)</w:t>
+              <w:t>Universal MariaDB 10.6+ / PostgreSQL 16 Architecture (1,849 Active Installed Machines, 1.77M Telemetry Rows in master_daily_rvm)</w:t>
             </w:r>
           </w:p>
         </w:tc>
@@ -1297,7 +1297,7 @@
                 <w:color w:val="0F172A"/>
                 <w:sz w:val="18"/>
               </w:rPr>
-              <w:t>Live directory of inspected candidate locations (Sopralluogo Completato) with 5-month recency filtering, volume tiers, and one-click 'Results 📊' prediction handoff.</w:t>
+              <w:t>Live directory of inspected candidate locations (Sopralluogo Completato, 61 machines) with 5-month recency filtering, volume tiers, and one-click 'Results 📊' prediction handoff.</w:t>
             </w:r>
           </w:p>
         </w:tc>
@@ -1427,7 +1427,7 @@
                 <w:color w:val="0F172A"/>
                 <w:sz w:val="18"/>
               </w:rPr>
-              <w:t>Pipeline candidate site exploration (Potenziale status) for preliminary economic feasibility screening prior to on-site technical inspection dispatch.</w:t>
+              <w:t>Pipeline candidate site exploration (Potenziale status, 331 machines) for preliminary economic feasibility screening prior to on-site technical inspection dispatch.</w:t>
             </w:r>
           </w:p>
         </w:tc>
@@ -1557,7 +1557,7 @@
                 <w:color w:val="0F172A"/>
                 <w:sz w:val="18"/>
               </w:rPr>
-              <w:t>Continuous fleet intelligence auditing 1,849 active machines in PostgreSQL with 10-option rule filtering, 2-year timeline outlier markers, and root-cause diagnostics.</w:t>
+              <w:t>Continuous fleet intelligence auditing 1,849 machines in database with 10-option rule filtering, 2-year timeline outlier markers, and root-cause diagnostics.</w:t>
             </w:r>
           </w:p>
         </w:tc>
@@ -1590,6 +1590,766 @@
                 <w:sz w:val="18"/>
               </w:rPr>
               <w:t>Field Maintenance &amp; Data Governance Teams</w:t>
+            </w:r>
+          </w:p>
+        </w:tc>
+      </w:tr>
+    </w:tbl>
+    <w:p>
+      <w:pPr>
+        <w:spacing w:after="80"/>
+      </w:pPr>
+    </w:p>
+    <w:p>
+      <w:pPr>
+        <w:pStyle w:val="Heading2"/>
+        <w:keepNext/>
+        <w:spacing w:before="280" w:after="80"/>
+      </w:pPr>
+      <w:r>
+        <w:rPr>
+          <w:rFonts w:ascii="Calibri" w:hAnsi="Calibri"/>
+          <w:b/>
+          <w:color w:val="198754"/>
+          <w:sz w:val="26"/>
+        </w:rPr>
+        <w:t>1.1 Verified National Fleet Census &amp; Pipeline Breakdown</w:t>
+      </w:r>
+    </w:p>
+    <w:p>
+      <w:pPr>
+        <w:spacing w:after="100" w:line="276" w:lineRule="auto"/>
+      </w:pPr>
+      <w:r>
+        <w:rPr>
+          <w:rFonts w:ascii="Calibri" w:hAnsi="Calibri"/>
+          <w:color w:val="0F172A"/>
+          <w:sz w:val="20"/>
+        </w:rPr>
+        <w:t>The Coripet intelligence architecture strictly filters and categorizes the national network into active operational installations and prospective candidate pipeline stages across Italy, removing all decommissioned or inactive machines:</w:t>
+      </w:r>
+    </w:p>
+    <w:tbl>
+      <w:tblPr>
+        <w:tblW w:type="auto" w:w="0"/>
+        <w:jc w:val="center"/>
+        <w:tblLayout w:type="fixed"/>
+        <w:tblLook w:firstColumn="1" w:firstRow="1" w:lastColumn="0" w:lastRow="0" w:noHBand="0" w:noVBand="1" w:val="04A0"/>
+      </w:tblPr>
+      <w:tblGrid>
+        <w:gridCol w:w="2484"/>
+        <w:gridCol w:w="2484"/>
+        <w:gridCol w:w="2484"/>
+        <w:gridCol w:w="2484"/>
+      </w:tblGrid>
+      <w:tr>
+        <w:tc>
+          <w:tcPr>
+            <w:tcW w:type="dxa" w:w="2448"/>
+            <w:shd w:fill="0f5132"/>
+            <w:tcMar>
+              <w:top w:w="110" w:type="dxa"/>
+              <w:bottom w:w="110" w:type="dxa"/>
+              <w:left w:w="130" w:type="dxa"/>
+              <w:right w:w="130" w:type="dxa"/>
+            </w:tcMar>
+            <w:tcBorders>
+              <w:top w:sz="4" w:val="single" w:color="0f5132"/>
+              <w:left w:sz="4" w:val="single" w:color="cbd5e1"/>
+              <w:bottom w:sz="12" w:val="single" w:color="0f172a"/>
+              <w:right w:sz="4" w:val="single" w:color="cbd5e1"/>
+            </w:tcBorders>
+          </w:tcPr>
+          <w:p>
+            <w:pPr>
+              <w:spacing w:before="0" w:after="0"/>
+              <w:jc w:val="left"/>
+            </w:pPr>
+            <w:r>
+              <w:rPr>
+                <w:rFonts w:ascii="Calibri" w:hAnsi="Calibri"/>
+                <w:b/>
+                <w:color w:val="FFFFFF"/>
+                <w:sz w:val="19"/>
+              </w:rPr>
+              <w:t>Fleet Census Metric</w:t>
+            </w:r>
+          </w:p>
+        </w:tc>
+        <w:tc>
+          <w:tcPr>
+            <w:tcW w:type="dxa" w:w="1584"/>
+            <w:shd w:fill="0f5132"/>
+            <w:tcMar>
+              <w:top w:w="110" w:type="dxa"/>
+              <w:bottom w:w="110" w:type="dxa"/>
+              <w:left w:w="130" w:type="dxa"/>
+              <w:right w:w="130" w:type="dxa"/>
+            </w:tcMar>
+            <w:tcBorders>
+              <w:top w:sz="4" w:val="single" w:color="0f5132"/>
+              <w:left w:sz="4" w:val="single" w:color="cbd5e1"/>
+              <w:bottom w:sz="12" w:val="single" w:color="0f172a"/>
+              <w:right w:sz="4" w:val="single" w:color="cbd5e1"/>
+            </w:tcBorders>
+          </w:tcPr>
+          <w:p>
+            <w:pPr>
+              <w:spacing w:before="0" w:after="0"/>
+              <w:jc w:val="left"/>
+            </w:pPr>
+            <w:r>
+              <w:rPr>
+                <w:rFonts w:ascii="Calibri" w:hAnsi="Calibri"/>
+                <w:b/>
+                <w:color w:val="FFFFFF"/>
+                <w:sz w:val="19"/>
+              </w:rPr>
+              <w:t>Exact Count</w:t>
+            </w:r>
+          </w:p>
+        </w:tc>
+        <w:tc>
+          <w:tcPr>
+            <w:tcW w:type="dxa" w:w="3312"/>
+            <w:shd w:fill="0f5132"/>
+            <w:tcMar>
+              <w:top w:w="110" w:type="dxa"/>
+              <w:bottom w:w="110" w:type="dxa"/>
+              <w:left w:w="130" w:type="dxa"/>
+              <w:right w:w="130" w:type="dxa"/>
+            </w:tcMar>
+            <w:tcBorders>
+              <w:top w:sz="4" w:val="single" w:color="0f5132"/>
+              <w:left w:sz="4" w:val="single" w:color="cbd5e1"/>
+              <w:bottom w:sz="12" w:val="single" w:color="0f172a"/>
+              <w:right w:sz="4" w:val="single" w:color="cbd5e1"/>
+            </w:tcBorders>
+          </w:tcPr>
+          <w:p>
+            <w:pPr>
+              <w:spacing w:before="0" w:after="0"/>
+              <w:jc w:val="left"/>
+            </w:pPr>
+            <w:r>
+              <w:rPr>
+                <w:rFonts w:ascii="Calibri" w:hAnsi="Calibri"/>
+                <w:b/>
+                <w:color w:val="FFFFFF"/>
+                <w:sz w:val="19"/>
+              </w:rPr>
+              <w:t>Database Scope &amp; Architectural Definition</w:t>
+            </w:r>
+          </w:p>
+        </w:tc>
+        <w:tc>
+          <w:tcPr>
+            <w:tcW w:type="dxa" w:w="2448"/>
+            <w:shd w:fill="0f5132"/>
+            <w:tcMar>
+              <w:top w:w="110" w:type="dxa"/>
+              <w:bottom w:w="110" w:type="dxa"/>
+              <w:left w:w="130" w:type="dxa"/>
+              <w:right w:w="130" w:type="dxa"/>
+            </w:tcMar>
+            <w:tcBorders>
+              <w:top w:sz="4" w:val="single" w:color="0f5132"/>
+              <w:left w:sz="4" w:val="single" w:color="cbd5e1"/>
+              <w:bottom w:sz="12" w:val="single" w:color="0f172a"/>
+              <w:right w:sz="4" w:val="single" w:color="cbd5e1"/>
+            </w:tcBorders>
+          </w:tcPr>
+          <w:p>
+            <w:pPr>
+              <w:spacing w:before="0" w:after="0"/>
+              <w:jc w:val="left"/>
+            </w:pPr>
+            <w:r>
+              <w:rPr>
+                <w:rFonts w:ascii="Calibri" w:hAnsi="Calibri"/>
+                <w:b/>
+                <w:color w:val="FFFFFF"/>
+                <w:sz w:val="19"/>
+              </w:rPr>
+              <w:t>Application &amp; Modeling Role</w:t>
+            </w:r>
+          </w:p>
+        </w:tc>
+      </w:tr>
+      <w:tr>
+        <w:tc>
+          <w:tcPr>
+            <w:tcW w:type="dxa" w:w="2448"/>
+            <w:shd w:fill="ffffff"/>
+            <w:tcMar>
+              <w:top w:w="75" w:type="dxa"/>
+              <w:bottom w:w="75" w:type="dxa"/>
+              <w:left w:w="110" w:type="dxa"/>
+              <w:right w:w="110" w:type="dxa"/>
+            </w:tcMar>
+            <w:tcBorders>
+              <w:top w:sz="4" w:val="single" w:color="cbd5e1"/>
+              <w:left w:sz="4" w:val="single" w:color="cbd5e1"/>
+              <w:bottom w:sz="4" w:val="single" w:color="cbd5e1"/>
+              <w:right w:sz="4" w:val="single" w:color="cbd5e1"/>
+            </w:tcBorders>
+          </w:tcPr>
+          <w:p>
+            <w:pPr>
+              <w:spacing w:before="0" w:after="0"/>
+              <w:jc w:val="left"/>
+            </w:pPr>
+            <w:r>
+              <w:rPr>
+                <w:rFonts w:ascii="Calibri" w:hAnsi="Calibri"/>
+                <w:color w:val="0F172A"/>
+                <w:sz w:val="18"/>
+              </w:rPr>
+              <w:t>Active Installed Fleet (INSTALLAZIONI)</w:t>
+            </w:r>
+          </w:p>
+        </w:tc>
+        <w:tc>
+          <w:tcPr>
+            <w:tcW w:type="dxa" w:w="1584"/>
+            <w:shd w:fill="ffffff"/>
+            <w:tcMar>
+              <w:top w:w="75" w:type="dxa"/>
+              <w:bottom w:w="75" w:type="dxa"/>
+              <w:left w:w="110" w:type="dxa"/>
+              <w:right w:w="110" w:type="dxa"/>
+            </w:tcMar>
+            <w:tcBorders>
+              <w:top w:sz="4" w:val="single" w:color="cbd5e1"/>
+              <w:left w:sz="4" w:val="single" w:color="cbd5e1"/>
+              <w:bottom w:sz="4" w:val="single" w:color="cbd5e1"/>
+              <w:right w:sz="4" w:val="single" w:color="cbd5e1"/>
+            </w:tcBorders>
+          </w:tcPr>
+          <w:p>
+            <w:pPr>
+              <w:spacing w:before="0" w:after="0"/>
+              <w:jc w:val="left"/>
+            </w:pPr>
+            <w:r>
+              <w:rPr>
+                <w:rFonts w:ascii="Calibri" w:hAnsi="Calibri"/>
+                <w:color w:val="0F172A"/>
+                <w:sz w:val="18"/>
+              </w:rPr>
+              <w:t>1,849 machines</w:t>
+            </w:r>
+          </w:p>
+        </w:tc>
+        <w:tc>
+          <w:tcPr>
+            <w:tcW w:type="dxa" w:w="3312"/>
+            <w:shd w:fill="ffffff"/>
+            <w:tcMar>
+              <w:top w:w="75" w:type="dxa"/>
+              <w:bottom w:w="75" w:type="dxa"/>
+              <w:left w:w="110" w:type="dxa"/>
+              <w:right w:w="110" w:type="dxa"/>
+            </w:tcMar>
+            <w:tcBorders>
+              <w:top w:sz="4" w:val="single" w:color="cbd5e1"/>
+              <w:left w:sz="4" w:val="single" w:color="cbd5e1"/>
+              <w:bottom w:sz="4" w:val="single" w:color="cbd5e1"/>
+              <w:right w:sz="4" w:val="single" w:color="cbd5e1"/>
+            </w:tcBorders>
+          </w:tcPr>
+          <w:p>
+            <w:pPr>
+              <w:spacing w:before="0" w:after="0"/>
+              <w:jc w:val="left"/>
+            </w:pPr>
+            <w:r>
+              <w:rPr>
+                <w:rFonts w:ascii="Calibri" w:hAnsi="Calibri"/>
+                <w:color w:val="0F172A"/>
+                <w:sz w:val="18"/>
+              </w:rPr>
+              <w:t>Official Coripet active operational installation universe (PowerBI Installazioni baseline). Exactly 1,849 live, actively collecting RVMs operating across Italy (1,217 Cestone, 425 Cassonetto, 207 Sacco; 986 DAINT_G, 165 DAINT_A-bis, 19 DAINT_B-bis, 6 DAINT_B, 2 DAINT_A, Ripet C-Front/Bis).</w:t>
+            </w:r>
+          </w:p>
+        </w:tc>
+        <w:tc>
+          <w:tcPr>
+            <w:tcW w:type="dxa" w:w="2448"/>
+            <w:shd w:fill="ffffff"/>
+            <w:tcMar>
+              <w:top w:w="75" w:type="dxa"/>
+              <w:bottom w:w="75" w:type="dxa"/>
+              <w:left w:w="110" w:type="dxa"/>
+              <w:right w:w="110" w:type="dxa"/>
+            </w:tcMar>
+            <w:tcBorders>
+              <w:top w:sz="4" w:val="single" w:color="cbd5e1"/>
+              <w:left w:sz="4" w:val="single" w:color="cbd5e1"/>
+              <w:bottom w:sz="4" w:val="single" w:color="cbd5e1"/>
+              <w:right w:sz="4" w:val="single" w:color="cbd5e1"/>
+            </w:tcBorders>
+          </w:tcPr>
+          <w:p>
+            <w:pPr>
+              <w:spacing w:before="0" w:after="0"/>
+              <w:jc w:val="left"/>
+            </w:pPr>
+            <w:r>
+              <w:rPr>
+                <w:rFonts w:ascii="Calibri" w:hAnsi="Calibri"/>
+                <w:color w:val="0F172A"/>
+                <w:sz w:val="18"/>
+              </w:rPr>
+              <w:t>Active commercial footprint and operational telemetry universe for fleet monitoring.</w:t>
+            </w:r>
+          </w:p>
+        </w:tc>
+      </w:tr>
+      <w:tr>
+        <w:tc>
+          <w:tcPr>
+            <w:tcW w:type="dxa" w:w="2448"/>
+            <w:shd w:fill="f8fafc"/>
+            <w:tcMar>
+              <w:top w:w="75" w:type="dxa"/>
+              <w:bottom w:w="75" w:type="dxa"/>
+              <w:left w:w="110" w:type="dxa"/>
+              <w:right w:w="110" w:type="dxa"/>
+            </w:tcMar>
+            <w:tcBorders>
+              <w:top w:sz="4" w:val="single" w:color="cbd5e1"/>
+              <w:left w:sz="4" w:val="single" w:color="cbd5e1"/>
+              <w:bottom w:sz="4" w:val="single" w:color="cbd5e1"/>
+              <w:right w:sz="4" w:val="single" w:color="cbd5e1"/>
+            </w:tcBorders>
+          </w:tcPr>
+          <w:p>
+            <w:pPr>
+              <w:spacing w:before="0" w:after="0"/>
+              <w:jc w:val="left"/>
+            </w:pPr>
+            <w:r>
+              <w:rPr>
+                <w:rFonts w:ascii="Calibri" w:hAnsi="Calibri"/>
+                <w:color w:val="0F172A"/>
+                <w:sz w:val="18"/>
+              </w:rPr>
+              <w:t>Certified AI Training Cohort</w:t>
+            </w:r>
+          </w:p>
+        </w:tc>
+        <w:tc>
+          <w:tcPr>
+            <w:tcW w:type="dxa" w:w="1584"/>
+            <w:shd w:fill="f8fafc"/>
+            <w:tcMar>
+              <w:top w:w="75" w:type="dxa"/>
+              <w:bottom w:w="75" w:type="dxa"/>
+              <w:left w:w="110" w:type="dxa"/>
+              <w:right w:w="110" w:type="dxa"/>
+            </w:tcMar>
+            <w:tcBorders>
+              <w:top w:sz="4" w:val="single" w:color="cbd5e1"/>
+              <w:left w:sz="4" w:val="single" w:color="cbd5e1"/>
+              <w:bottom w:sz="4" w:val="single" w:color="cbd5e1"/>
+              <w:right w:sz="4" w:val="single" w:color="cbd5e1"/>
+            </w:tcBorders>
+          </w:tcPr>
+          <w:p>
+            <w:pPr>
+              <w:spacing w:before="0" w:after="0"/>
+              <w:jc w:val="left"/>
+            </w:pPr>
+            <w:r>
+              <w:rPr>
+                <w:rFonts w:ascii="Calibri" w:hAnsi="Calibri"/>
+                <w:color w:val="0F172A"/>
+                <w:sz w:val="18"/>
+              </w:rPr>
+              <w:t>1,681 stores</w:t>
+            </w:r>
+          </w:p>
+        </w:tc>
+        <w:tc>
+          <w:tcPr>
+            <w:tcW w:type="dxa" w:w="3312"/>
+            <w:shd w:fill="f8fafc"/>
+            <w:tcMar>
+              <w:top w:w="75" w:type="dxa"/>
+              <w:bottom w:w="75" w:type="dxa"/>
+              <w:left w:w="110" w:type="dxa"/>
+              <w:right w:w="110" w:type="dxa"/>
+            </w:tcMar>
+            <w:tcBorders>
+              <w:top w:sz="4" w:val="single" w:color="cbd5e1"/>
+              <w:left w:sz="4" w:val="single" w:color="cbd5e1"/>
+              <w:bottom w:sz="4" w:val="single" w:color="cbd5e1"/>
+              <w:right w:sz="4" w:val="single" w:color="cbd5e1"/>
+            </w:tcBorders>
+          </w:tcPr>
+          <w:p>
+            <w:pPr>
+              <w:spacing w:before="0" w:after="0"/>
+              <w:jc w:val="left"/>
+            </w:pPr>
+            <w:r>
+              <w:rPr>
+                <w:rFonts w:ascii="Calibri" w:hAnsi="Calibri"/>
+                <w:color w:val="0F172A"/>
+                <w:sz w:val="18"/>
+              </w:rPr>
+              <w:t>1,481,324 certified daily collection records meeting 4-gate maturity rules (supermarket grocery retail, active installation, standard reward attribute, mature operating baseline &gt;= 90 days).</w:t>
+            </w:r>
+          </w:p>
+        </w:tc>
+        <w:tc>
+          <w:tcPr>
+            <w:tcW w:type="dxa" w:w="2448"/>
+            <w:shd w:fill="f8fafc"/>
+            <w:tcMar>
+              <w:top w:w="75" w:type="dxa"/>
+              <w:bottom w:w="75" w:type="dxa"/>
+              <w:left w:w="110" w:type="dxa"/>
+              <w:right w:w="110" w:type="dxa"/>
+            </w:tcMar>
+            <w:tcBorders>
+              <w:top w:sz="4" w:val="single" w:color="cbd5e1"/>
+              <w:left w:sz="4" w:val="single" w:color="cbd5e1"/>
+              <w:bottom w:sz="4" w:val="single" w:color="cbd5e1"/>
+              <w:right w:sz="4" w:val="single" w:color="cbd5e1"/>
+            </w:tcBorders>
+          </w:tcPr>
+          <w:p>
+            <w:pPr>
+              <w:spacing w:before="0" w:after="0"/>
+              <w:jc w:val="left"/>
+            </w:pPr>
+            <w:r>
+              <w:rPr>
+                <w:rFonts w:ascii="Calibri" w:hAnsi="Calibri"/>
+                <w:color w:val="0F172A"/>
+                <w:sz w:val="18"/>
+              </w:rPr>
+              <w:t>Authoritative baseline training and cross-validation population for MultiTaskRVMNet &amp; LightGBM.</w:t>
+            </w:r>
+          </w:p>
+        </w:tc>
+      </w:tr>
+      <w:tr>
+        <w:tc>
+          <w:tcPr>
+            <w:tcW w:type="dxa" w:w="2448"/>
+            <w:shd w:fill="ffffff"/>
+            <w:tcMar>
+              <w:top w:w="75" w:type="dxa"/>
+              <w:bottom w:w="75" w:type="dxa"/>
+              <w:left w:w="110" w:type="dxa"/>
+              <w:right w:w="110" w:type="dxa"/>
+            </w:tcMar>
+            <w:tcBorders>
+              <w:top w:sz="4" w:val="single" w:color="cbd5e1"/>
+              <w:left w:sz="4" w:val="single" w:color="cbd5e1"/>
+              <w:bottom w:sz="4" w:val="single" w:color="cbd5e1"/>
+              <w:right w:sz="4" w:val="single" w:color="cbd5e1"/>
+            </w:tcBorders>
+          </w:tcPr>
+          <w:p>
+            <w:pPr>
+              <w:spacing w:before="0" w:after="0"/>
+              <w:jc w:val="left"/>
+            </w:pPr>
+            <w:r>
+              <w:rPr>
+                <w:rFonts w:ascii="Calibri" w:hAnsi="Calibri"/>
+                <w:color w:val="0F172A"/>
+                <w:sz w:val="18"/>
+              </w:rPr>
+              <w:t>Inspected Candidate Pipeline (SPL)</w:t>
+            </w:r>
+          </w:p>
+        </w:tc>
+        <w:tc>
+          <w:tcPr>
+            <w:tcW w:type="dxa" w:w="1584"/>
+            <w:shd w:fill="ffffff"/>
+            <w:tcMar>
+              <w:top w:w="75" w:type="dxa"/>
+              <w:bottom w:w="75" w:type="dxa"/>
+              <w:left w:w="110" w:type="dxa"/>
+              <w:right w:w="110" w:type="dxa"/>
+            </w:tcMar>
+            <w:tcBorders>
+              <w:top w:sz="4" w:val="single" w:color="cbd5e1"/>
+              <w:left w:sz="4" w:val="single" w:color="cbd5e1"/>
+              <w:bottom w:sz="4" w:val="single" w:color="cbd5e1"/>
+              <w:right w:sz="4" w:val="single" w:color="cbd5e1"/>
+            </w:tcBorders>
+          </w:tcPr>
+          <w:p>
+            <w:pPr>
+              <w:spacing w:before="0" w:after="0"/>
+              <w:jc w:val="left"/>
+            </w:pPr>
+            <w:r>
+              <w:rPr>
+                <w:rFonts w:ascii="Calibri" w:hAnsi="Calibri"/>
+                <w:color w:val="0F172A"/>
+                <w:sz w:val="18"/>
+              </w:rPr>
+              <w:t>61 machines</w:t>
+            </w:r>
+          </w:p>
+        </w:tc>
+        <w:tc>
+          <w:tcPr>
+            <w:tcW w:type="dxa" w:w="3312"/>
+            <w:shd w:fill="ffffff"/>
+            <w:tcMar>
+              <w:top w:w="75" w:type="dxa"/>
+              <w:bottom w:w="75" w:type="dxa"/>
+              <w:left w:w="110" w:type="dxa"/>
+              <w:right w:w="110" w:type="dxa"/>
+            </w:tcMar>
+            <w:tcBorders>
+              <w:top w:sz="4" w:val="single" w:color="cbd5e1"/>
+              <w:left w:sz="4" w:val="single" w:color="cbd5e1"/>
+              <w:bottom w:sz="4" w:val="single" w:color="cbd5e1"/>
+              <w:right w:sz="4" w:val="single" w:color="cbd5e1"/>
+            </w:tcBorders>
+          </w:tcPr>
+          <w:p>
+            <w:pPr>
+              <w:spacing w:before="0" w:after="0"/>
+              <w:jc w:val="left"/>
+            </w:pPr>
+            <w:r>
+              <w:rPr>
+                <w:rFonts w:ascii="Calibri" w:hAnsi="Calibri"/>
+                <w:color w:val="0F172A"/>
+                <w:sz w:val="18"/>
+              </w:rPr>
+              <w:t>Candidate supermarket store locations in Tab 2 with completed on-site technical inspection ('Sopralluogo Completato').</w:t>
+            </w:r>
+          </w:p>
+        </w:tc>
+        <w:tc>
+          <w:tcPr>
+            <w:tcW w:type="dxa" w:w="2448"/>
+            <w:shd w:fill="ffffff"/>
+            <w:tcMar>
+              <w:top w:w="75" w:type="dxa"/>
+              <w:bottom w:w="75" w:type="dxa"/>
+              <w:left w:w="110" w:type="dxa"/>
+              <w:right w:w="110" w:type="dxa"/>
+            </w:tcMar>
+            <w:tcBorders>
+              <w:top w:sz="4" w:val="single" w:color="cbd5e1"/>
+              <w:left w:sz="4" w:val="single" w:color="cbd5e1"/>
+              <w:bottom w:sz="4" w:val="single" w:color="cbd5e1"/>
+              <w:right w:sz="4" w:val="single" w:color="cbd5e1"/>
+            </w:tcBorders>
+          </w:tcPr>
+          <w:p>
+            <w:pPr>
+              <w:spacing w:before="0" w:after="0"/>
+              <w:jc w:val="left"/>
+            </w:pPr>
+            <w:r>
+              <w:rPr>
+                <w:rFonts w:ascii="Calibri" w:hAnsi="Calibri"/>
+                <w:color w:val="0F172A"/>
+                <w:sz w:val="18"/>
+              </w:rPr>
+              <w:t>Immediate deployment decision, capital allocation, and underwriting handoff pipeline.</w:t>
+            </w:r>
+          </w:p>
+        </w:tc>
+      </w:tr>
+      <w:tr>
+        <w:tc>
+          <w:tcPr>
+            <w:tcW w:type="dxa" w:w="2448"/>
+            <w:shd w:fill="f8fafc"/>
+            <w:tcMar>
+              <w:top w:w="75" w:type="dxa"/>
+              <w:bottom w:w="75" w:type="dxa"/>
+              <w:left w:w="110" w:type="dxa"/>
+              <w:right w:w="110" w:type="dxa"/>
+            </w:tcMar>
+            <w:tcBorders>
+              <w:top w:sz="4" w:val="single" w:color="cbd5e1"/>
+              <w:left w:sz="4" w:val="single" w:color="cbd5e1"/>
+              <w:bottom w:sz="4" w:val="single" w:color="cbd5e1"/>
+              <w:right w:sz="4" w:val="single" w:color="cbd5e1"/>
+            </w:tcBorders>
+          </w:tcPr>
+          <w:p>
+            <w:pPr>
+              <w:spacing w:before="0" w:after="0"/>
+              <w:jc w:val="left"/>
+            </w:pPr>
+            <w:r>
+              <w:rPr>
+                <w:rFonts w:ascii="Calibri" w:hAnsi="Calibri"/>
+                <w:color w:val="0F172A"/>
+                <w:sz w:val="18"/>
+              </w:rPr>
+              <w:t>Prospective Candidate Pipeline (POT)</w:t>
+            </w:r>
+          </w:p>
+        </w:tc>
+        <w:tc>
+          <w:tcPr>
+            <w:tcW w:type="dxa" w:w="1584"/>
+            <w:shd w:fill="f8fafc"/>
+            <w:tcMar>
+              <w:top w:w="75" w:type="dxa"/>
+              <w:bottom w:w="75" w:type="dxa"/>
+              <w:left w:w="110" w:type="dxa"/>
+              <w:right w:w="110" w:type="dxa"/>
+            </w:tcMar>
+            <w:tcBorders>
+              <w:top w:sz="4" w:val="single" w:color="cbd5e1"/>
+              <w:left w:sz="4" w:val="single" w:color="cbd5e1"/>
+              <w:bottom w:sz="4" w:val="single" w:color="cbd5e1"/>
+              <w:right w:sz="4" w:val="single" w:color="cbd5e1"/>
+            </w:tcBorders>
+          </w:tcPr>
+          <w:p>
+            <w:pPr>
+              <w:spacing w:before="0" w:after="0"/>
+              <w:jc w:val="left"/>
+            </w:pPr>
+            <w:r>
+              <w:rPr>
+                <w:rFonts w:ascii="Calibri" w:hAnsi="Calibri"/>
+                <w:color w:val="0F172A"/>
+                <w:sz w:val="18"/>
+              </w:rPr>
+              <w:t>331 machines</w:t>
+            </w:r>
+          </w:p>
+        </w:tc>
+        <w:tc>
+          <w:tcPr>
+            <w:tcW w:type="dxa" w:w="3312"/>
+            <w:shd w:fill="f8fafc"/>
+            <w:tcMar>
+              <w:top w:w="75" w:type="dxa"/>
+              <w:bottom w:w="75" w:type="dxa"/>
+              <w:left w:w="110" w:type="dxa"/>
+              <w:right w:w="110" w:type="dxa"/>
+            </w:tcMar>
+            <w:tcBorders>
+              <w:top w:sz="4" w:val="single" w:color="cbd5e1"/>
+              <w:left w:sz="4" w:val="single" w:color="cbd5e1"/>
+              <w:bottom w:sz="4" w:val="single" w:color="cbd5e1"/>
+              <w:right w:sz="4" w:val="single" w:color="cbd5e1"/>
+            </w:tcBorders>
+          </w:tcPr>
+          <w:p>
+            <w:pPr>
+              <w:spacing w:before="0" w:after="0"/>
+              <w:jc w:val="left"/>
+            </w:pPr>
+            <w:r>
+              <w:rPr>
+                <w:rFonts w:ascii="Calibri" w:hAnsi="Calibri"/>
+                <w:color w:val="0F172A"/>
+                <w:sz w:val="18"/>
+              </w:rPr>
+              <w:t>Prospective candidate supermarket locations in Tab 3 undergoing preliminary feasibility screening ('Potenziale').</w:t>
+            </w:r>
+          </w:p>
+        </w:tc>
+        <w:tc>
+          <w:tcPr>
+            <w:tcW w:type="dxa" w:w="2448"/>
+            <w:shd w:fill="f8fafc"/>
+            <w:tcMar>
+              <w:top w:w="75" w:type="dxa"/>
+              <w:bottom w:w="75" w:type="dxa"/>
+              <w:left w:w="110" w:type="dxa"/>
+              <w:right w:w="110" w:type="dxa"/>
+            </w:tcMar>
+            <w:tcBorders>
+              <w:top w:sz="4" w:val="single" w:color="cbd5e1"/>
+              <w:left w:sz="4" w:val="single" w:color="cbd5e1"/>
+              <w:bottom w:sz="4" w:val="single" w:color="cbd5e1"/>
+              <w:right w:sz="4" w:val="single" w:color="cbd5e1"/>
+            </w:tcBorders>
+          </w:tcPr>
+          <w:p>
+            <w:pPr>
+              <w:spacing w:before="0" w:after="0"/>
+              <w:jc w:val="left"/>
+            </w:pPr>
+            <w:r>
+              <w:rPr>
+                <w:rFonts w:ascii="Calibri" w:hAnsi="Calibri"/>
+                <w:color w:val="0F172A"/>
+                <w:sz w:val="18"/>
+              </w:rPr>
+              <w:t>Early-stage commercial opportunity exploration and screening prior to field dispatch.</w:t>
+            </w:r>
+          </w:p>
+        </w:tc>
+      </w:tr>
+    </w:tbl>
+    <w:p>
+      <w:pPr>
+        <w:spacing w:after="80"/>
+      </w:pPr>
+    </w:p>
+    <w:tbl>
+      <w:tblPr>
+        <w:tblW w:type="auto" w:w="0"/>
+        <w:jc w:val="center"/>
+        <w:tblLayout w:type="fixed"/>
+        <w:tblLook w:firstColumn="1" w:firstRow="1" w:lastColumn="0" w:lastRow="0" w:noHBand="0" w:noVBand="1" w:val="04A0"/>
+      </w:tblPr>
+      <w:tblGrid>
+        <w:gridCol w:w="9936"/>
+      </w:tblGrid>
+      <w:tr>
+        <w:tc>
+          <w:tcPr>
+            <w:tcW w:type="dxa" w:w="9792"/>
+            <w:shd w:fill="f0fdf4"/>
+            <w:tcMar>
+              <w:top w:w="130" w:type="dxa"/>
+              <w:bottom w:w="130" w:type="dxa"/>
+              <w:left w:w="180" w:type="dxa"/>
+              <w:right w:w="160" w:type="dxa"/>
+            </w:tcMar>
+            <w:tcBorders>
+              <w:top w:sz="4" w:val="single" w:color="cbd5e1"/>
+              <w:left w:sz="24" w:val="single" w:color="198754"/>
+              <w:bottom w:sz="4" w:val="single" w:color="cbd5e1"/>
+              <w:right w:sz="4" w:val="single" w:color="cbd5e1"/>
+            </w:tcBorders>
+          </w:tcPr>
+          <w:p>
+            <w:pPr>
+              <w:spacing w:before="40" w:after="40" w:line="276" w:lineRule="auto"/>
+            </w:pPr>
+            <w:r>
+              <w:rPr>
+                <w:rFonts w:ascii="Calibri" w:hAnsi="Calibri"/>
+                <w:b/>
+                <w:color w:val="0F5132"/>
+                <w:sz w:val="20"/>
+              </w:rPr>
+              <w:t xml:space="preserve">📌 ACTIVE FLEET &amp; PIPELINE CENSUS CERTIFICATION: </w:t>
+            </w:r>
+            <w:r>
+              <w:rPr>
+                <w:rFonts w:ascii="Calibri" w:hAnsi="Calibri"/>
+                <w:color w:val="0F172A"/>
+                <w:sz w:val="19"/>
+              </w:rPr>
+              <w:t>The operational network consists strictly of 1,849 active installed machines across Italy, directly matching Coripet's official PowerBI Installazioni dashboard. All decommissioned, inactive, or removed machines have been purged from the active operational scope. For predictive machine learning modeling, exactly 1,681 mature active stores satisfy all 4 certification gates (PUNTOVENDITA retail classification, active status, standard reward attribute, and &gt;= 90-day post-activation maturity). Candidate uninstalled locations are tracked separately in the SPL (61 inspected) and POT (331 prospective) development pipelines.</w:t>
             </w:r>
           </w:p>
         </w:tc>
@@ -5055,7 +5815,7 @@
           <w:color w:val="0F172A"/>
           <w:sz w:val="20"/>
         </w:rPr>
-        <w:t>Network benchmark percentile ranking this store against the 1,849 operational Coripet machines.</w:t>
+        <w:t>Network benchmark percentile ranking this store against the 1,849 active installed Coripet machines across Italy.</w:t>
       </w:r>
     </w:p>
     <w:p>
@@ -9761,7 +10521,7 @@
           <w:color w:val="0F172A"/>
           <w:sz w:val="20"/>
         </w:rPr>
-        <w:t>Tab 4 (`🔍 Outlier &amp; Defect Simulator`) provides a complete fleet intelligence and predictive maintenance engine. It continuously audits all 1,849 operational machines in PostgreSQL to identify hardware breakdowns, capacity jams, commercial spikes, and erratic operating regimes.</w:t>
+        <w:t>Tab 4 (`🔍 Outlier &amp; Defect Simulator`) provides a complete fleet intelligence and predictive maintenance engine. It continuously audits all 1,849 active installed machines in the live census to identify hardware breakdowns, capacity jams, commercial spikes, and erratic operating regimes.</w:t>
       </w:r>
     </w:p>
     <w:p>
@@ -11232,7 +11992,7 @@
                 <w:color w:val="0F172A"/>
                 <w:sz w:val="18"/>
               </w:rPr>
-              <w:t>Displays all 1,849 machines across the national network including healthy units.</w:t>
+              <w:t>Displays all 1,849 machines in the audited diagnostic cohort including healthy units.</w:t>
             </w:r>
           </w:p>
         </w:tc>
@@ -11458,7 +12218,7 @@
           <w:color w:val="0F172A"/>
           <w:sz w:val="20"/>
         </w:rPr>
-        <w:t>PostgreSQL 16 relational database with master table `master_daily_rvm` containing 600k+ collection records. Optimized with sub-10ms indexed UNION queries and connection pooling.</w:t>
+        <w:t>Universal MariaDB 10.6+ and PostgreSQL 16 relational database with master table `master_daily_rvm` containing 1.77M+ (1,770,755) certified collection records across the 1,849 active installed machines. Optimized with sub-10ms indexed UNION queries and connection pooling.</w:t>
       </w:r>
     </w:p>
     <w:p>

</xml_diff>